<commit_message>
- Insitution option removed from signup page. - Unlimited label added in plan cards. - Make profile state clickable and redirect to profile. - Twice signature on Cover letter generation issue solved. - View Doc button added on docs cards & removed unwanted elements. - In My docs - Search error solved, reset btn & search btn added. - step5 generating agent - UI improved for Ai auto Docx. - In my docs - Initially loads 10 docs, show more btn & number counting added. - AI auto doc - autopilot enable/disable toggle btn UI added
</commit_message>
<xml_diff>
--- a/backend/CareerPilot_Cover_Letter.docx
+++ b/backend/CareerPilot_Cover_Letter.docx
@@ -7,17 +7,19 @@
         <w:pStyle w:val="FirstParagraph"/>
       </w:pPr>
       <w:r>
+        <w:t xml:space="preserve">Cover Letter - Mohd Arsalan</w:t>
+      </w:r>
+    </w:p>
+    <w:p>
+      <w:pPr>
+        <w:pStyle w:val="BodyText"/>
+      </w:pPr>
+      <w:r>
         <w:rPr>
           <w:b/>
           <w:bCs/>
         </w:rPr>
-        <w:t xml:space="preserve">Sandeep Singh Panwar</w:t>
-      </w:r>
-      <w:r>
-        <w:br/>
-      </w:r>
-      <w:r>
-        <w:t xml:space="preserve">vk@gmail.com</w:t>
+        <w:t xml:space="preserve">Mohd Arsalan</w:t>
       </w:r>
     </w:p>
     <w:p>
@@ -25,7 +27,23 @@
         <w:pStyle w:val="BodyText"/>
       </w:pPr>
       <w:r>
-        <w:t xml:space="preserve">October 26, 2023</w:t>
+        <w:t xml:space="preserve">+91 7033802514</w:t>
+      </w:r>
+    </w:p>
+    <w:p>
+      <w:pPr>
+        <w:pStyle w:val="BodyText"/>
+      </w:pPr>
+      <w:r>
+        <w:t xml:space="preserve">vinay@helpstudyabroad.com</w:t>
+      </w:r>
+    </w:p>
+    <w:p>
+      <w:pPr>
+        <w:pStyle w:val="BodyText"/>
+      </w:pPr>
+      <w:r>
+        <w:br/>
       </w:r>
     </w:p>
     <w:p>
@@ -41,7 +59,7 @@
         <w:pStyle w:val="BodyText"/>
       </w:pPr>
       <w:r>
-        <w:t xml:space="preserve">I am writing to express my enthusiastic interest in Full Stack Developer opportunities, particularly those focused on modern web technologies such as C# Web API, Angular, and PostgreSQL. As a recent graduate with a Bachelor of Computer Applications (BCA) from Graphic Era Hill University Dehradun, I have established a strong academic foundation in software development principles and possess a genuine passion for building high-quality, seamless web applications.</w:t>
+        <w:t xml:space="preserve">I am writing to express my keen interest in hotel management opportunities. My passion for delivering exceptional guest experiences, coupled with my skills in [mention 1-2 relevant skills from profile e.g., "communication and problem-solving"], makes me a strong candidate to contribute to your team's success.</w:t>
       </w:r>
     </w:p>
     <w:p>
@@ -49,7 +67,7 @@
         <w:pStyle w:val="BodyText"/>
       </w:pPr>
       <w:r>
-        <w:t xml:space="preserve">My academic journey has equipped me with a robust understanding of programming fundamentals, data structures, and algorithms. I have gained hands-on experience with foundational web technologies like JavaScript, HTML, and CSS, and my project work, including an 'ai chat bot', has allowed me to apply theoretical knowledge to practical coding challenges. While my direct professional experience in C# Web API, Angular, and PostgreSQL is nascent, I am actively engaged in developing my expertise in these areas, eager to contribute my problem-solving skills and learn rapidly within a dynamic engineering team.</w:t>
+        <w:t xml:space="preserve">While my background may appear unconventional, my projects have honed skills directly transferable to the hotel industry. For example, leading the "Norda fashion application" project demonstrates my ability to manage complex projects and adapt to rapidly changing environments. The "Get-a-pro" project showcased my skills in building user-friendly interfaces and integrating various technologies, skills that translate to improving guest interactions and streamlining hotel operations. My Golang expertise, while seemingly technical, reflects my problem-solving abilities and commitment to efficiency, qualities highly valued in hotel management.</w:t>
       </w:r>
     </w:p>
     <w:p>
@@ -57,7 +75,23 @@
         <w:pStyle w:val="BodyText"/>
       </w:pPr>
       <w:r>
-        <w:t xml:space="preserve">I am confident that my foundational technical skills, combined with my dedication to continuous learning and a collaborative spirit, make me a promising candidate for a challenging Full Stack Developer role. I am keen to join an organization that values an innovative spirit and supportive teams, and where I can grow my skills while making a meaningful impact. Thank you for considering my application. I have attached my resume for your detailed review and welcome the opportunity to discuss how my potential and enthusiasm can contribute to your team's success.</w:t>
+        <w:t xml:space="preserve">Thank you for considering my application. I am eager to discuss how my unique skills and dedication can contribute to your organization. I have attached my resume for your review and welcome the opportunity to discuss how I can contribute to your team.</w:t>
+      </w:r>
+    </w:p>
+    <w:p>
+      <w:pPr>
+        <w:pStyle w:val="BodyText"/>
+      </w:pPr>
+      <w:r>
+        <w:t xml:space="preserve">Best regards,</w:t>
+      </w:r>
+    </w:p>
+    <w:p>
+      <w:pPr>
+        <w:pStyle w:val="BodyText"/>
+      </w:pPr>
+      <w:r>
+        <w:t xml:space="preserve">Mohd Arsalan</w:t>
       </w:r>
     </w:p>
     <w:p>
@@ -73,7 +107,7 @@
         <w:pStyle w:val="BodyText"/>
       </w:pPr>
       <w:r>
-        <w:t xml:space="preserve">Sandeep Singh Panwar</w:t>
+        <w:t xml:space="preserve">Mohd Arsalan</w:t>
       </w:r>
     </w:p>
     <w:sectPr>

</xml_diff>